<commit_message>
final commit, no report
</commit_message>
<xml_diff>
--- a/Report.docx
+++ b/Report.docx
@@ -35,6 +35,309 @@
       </w:r>
       <w:r>
         <w:t>as inference to accelerate further iterations. In essence, if the robot arm begins at point A with the goal of moving to point B, but instead ends the episode at point C, HER instead changes the goal from point B to point C, recording the episode as a successful attempt at moving from point A to point C.</w:t>
+      </w:r>
+    </w:p>
+    <w:p>
+      <w:r>
+        <w:br w:type="page"/>
+      </w:r>
+    </w:p>
+    <w:p>
+      <w:pPr>
+        <w:pStyle w:val="Title"/>
+      </w:pPr>
+      <w:r>
+        <w:t>Final Report - Outline</w:t>
+      </w:r>
+    </w:p>
+    <w:p>
+      <w:pPr>
+        <w:pStyle w:val="Heading1"/>
+      </w:pPr>
+      <w:r>
+        <w:t>1. Abstract / Summary</w:t>
+      </w:r>
+    </w:p>
+    <w:p>
+      <w:r>
+        <w:t>•  The question: does gradual bias introduction beat clean or instant randomization?</w:t>
+      </w:r>
+    </w:p>
+    <w:p>
+      <w:r>
+        <w:t>•  The hypothesis: an optimal ramp rate alpha exists</w:t>
+      </w:r>
+    </w:p>
+    <w:p>
+      <w:r>
+        <w:t>•  Headline finding: slow curriculum wins by avoiding forgetting; no interior sweet spot; instant DR is worst</w:t>
+      </w:r>
+    </w:p>
+    <w:p>
+      <w:pPr>
+        <w:pStyle w:val="Heading1"/>
+      </w:pPr>
+      <w:r>
+        <w:t>2. Introduction &amp; Motivation</w:t>
+      </w:r>
+    </w:p>
+    <w:p>
+      <w:r>
+        <w:t>•  Sim-to-real gap: why simulation-trained policies fail on physical robots</w:t>
+      </w:r>
+    </w:p>
+    <w:p>
+      <w:r>
+        <w:t>•  Systematic actuation error vs. random noise (the bias is consistent, not zero-mean)</w:t>
+      </w:r>
+    </w:p>
+    <w:p>
+      <w:r>
+        <w:t>•  Domain randomization as the standard mitigation; gap probed here is the timing of randomization, not its presence</w:t>
+      </w:r>
+    </w:p>
+    <w:p>
+      <w:r>
+        <w:t>•  State the hypothesis explicitly</w:t>
+      </w:r>
+    </w:p>
+    <w:p>
+      <w:pPr>
+        <w:pStyle w:val="Heading1"/>
+      </w:pPr>
+      <w:r>
+        <w:t>3. Setting up the environment</w:t>
+      </w:r>
+    </w:p>
+    <w:p>
+      <w:r>
+        <w:t>•  Gymnasium FetchReach, 4D action space, 50-step episodes, 5 cm success threshold</w:t>
+      </w:r>
+    </w:p>
+    <w:p>
+      <w:r>
+        <w:t>•  Sparse vs. dense reward (existing text)</w:t>
+      </w:r>
+    </w:p>
+    <w:p>
+      <w:r>
+        <w:t>•  Hindsight Experience Replay (existing text)</w:t>
+      </w:r>
+    </w:p>
+    <w:p>
+      <w:r>
+        <w:t>•  Algorithm choice: SAC + HER, why off-policy + replay suits sparse goal-conditioned tasks</w:t>
+      </w:r>
+    </w:p>
+    <w:p>
+      <w:r>
+        <w:t>•  Graph: optional diagram of arm/goal geometry</w:t>
+      </w:r>
+    </w:p>
+    <w:p>
+      <w:pPr>
+        <w:pStyle w:val="Heading1"/>
+      </w:pPr>
+      <w:r>
+        <w:t>4. The Error Model &amp; Bias Wrapper</w:t>
+      </w:r>
+    </w:p>
+    <w:p>
+      <w:r>
+        <w:t>•  Per-episode additive bias Uniform(-eps(t), +eps(t)), held constant within an episode (systematic != noise)</w:t>
+      </w:r>
+    </w:p>
+    <w:p>
+      <w:r>
+        <w:t>•  The schedule eps(t) = min(eps_max, alpha*t)</w:t>
+      </w:r>
+    </w:p>
+    <w:p>
+      <w:r>
+        <w:t>•  Wrapper design: curriculum / instant / fixed modes; the mastery gate (C5)</w:t>
+      </w:r>
+    </w:p>
+    <w:p>
+      <w:r>
+        <w:t>•  Why bias is applied at the action level (actuator analogy)</w:t>
+      </w:r>
+    </w:p>
+    <w:p>
+      <w:r>
+        <w:t>•  Graph: eps(t) vs. timestep, all conditions overlaid (shows what slow/medium/fast/instant/gated mean)</w:t>
+      </w:r>
+    </w:p>
+    <w:p>
+      <w:pPr>
+        <w:pStyle w:val="Heading1"/>
+      </w:pPr>
+      <w:r>
+        <w:t>5. Experimental Design</w:t>
+      </w:r>
+    </w:p>
+    <w:p>
+      <w:r>
+        <w:t>•  Choosing eps_max = 1.1 (the ~57% mid-degradation rationale)</w:t>
+      </w:r>
+    </w:p>
+    <w:p>
+      <w:r>
+        <w:t>•  Condition matrix (C0-C5) table</w:t>
+      </w:r>
+    </w:p>
+    <w:p>
+      <w:r>
+        <w:t>•  Controls: identical hyperparameters/architecture/steps; only alpha and eps_max vary; 3 seeds</w:t>
+      </w:r>
+    </w:p>
+    <w:p>
+      <w:r>
+        <w:t>•  The forgetting probe (clean-env eval during training) - what it measures and why</w:t>
+      </w:r>
+    </w:p>
+    <w:p>
+      <w:r>
+        <w:t>•  Graph: success rate vs. bias magnitude for the clean policy (justifies eps_max = 1.1)</w:t>
+      </w:r>
+    </w:p>
+    <w:p>
+      <w:pPr>
+        <w:pStyle w:val="Heading1"/>
+      </w:pPr>
+      <w:r>
+        <w:t>6. Results</w:t>
+      </w:r>
+    </w:p>
+    <w:p>
+      <w:r>
+        <w:t>•  Robustness vs. bias magnitude across eps = 0.5 / 0.8 / 1.1 (main table)</w:t>
+      </w:r>
+    </w:p>
+    <w:p>
+      <w:r>
+        <w:t>•  Clean-competence cross-check at eps=1.1 (forgetting outcome)</w:t>
+      </w:r>
+    </w:p>
+    <w:p>
+      <w:r>
+        <w:t>•  The saturation effect at eps=1.1 (why conditions collapse together there)</w:t>
+      </w:r>
+    </w:p>
+    <w:p>
+      <w:r>
+        <w:t>•  Graph: robustness curve - biased success vs. eps, one line per condition (ood_wide.csv) - HEADLINE PLOT</w:t>
+      </w:r>
+    </w:p>
+    <w:p>
+      <w:r>
+        <w:t>•  Graph: bar chart - clean success per condition with error bars (eval_summary.csv)</w:t>
+      </w:r>
+    </w:p>
+    <w:p>
+      <w:r>
+        <w:t>•  Graph: forgetting curves - clean success vs. training timestep, all conditions (forgetting_wide.csv)</w:t>
+      </w:r>
+    </w:p>
+    <w:p>
+      <w:r>
+        <w:t>•  Graph (optional): bar chart of biased success at eps=1.1 to show saturation flatness</w:t>
+      </w:r>
+    </w:p>
+    <w:p>
+      <w:pPr>
+        <w:pStyle w:val="Heading1"/>
+      </w:pPr>
+      <w:r>
+        <w:t>7. Interpretation / Discussion</w:t>
+      </w:r>
+    </w:p>
+    <w:p>
+      <w:r>
+        <w:t>•  Hypothesis partially supported - the twist: mechanism is forgetting avoidance, not superior bias adaptation</w:t>
+      </w:r>
+    </w:p>
+    <w:p>
+      <w:r>
+        <w:t>•  Why slower is monotonically better here (no interior optimum found)</w:t>
+      </w:r>
+    </w:p>
+    <w:p>
+      <w:r>
+        <w:t>•  Why instant DR is actively harmful</w:t>
+      </w:r>
+    </w:p>
+    <w:p>
+      <w:r>
+        <w:t>•  Why eps=1.1 flatness is a clipping/saturation artifact, not a null result</w:t>
+      </w:r>
+    </w:p>
+    <w:p>
+      <w:r>
+        <w:t>•  C5 gated underperformance - what the gate did/didn't buy</w:t>
+      </w:r>
+    </w:p>
+    <w:p>
+      <w:pPr>
+        <w:pStyle w:val="Heading1"/>
+      </w:pPr>
+      <w:r>
+        <w:t>8. Limitations</w:t>
+      </w:r>
+    </w:p>
+    <w:p>
+      <w:r>
+        <w:t>•  Uniform additive bias is simplified (no backlash, drift, joint nonlinearity)</w:t>
+      </w:r>
+    </w:p>
+    <w:p>
+      <w:r>
+        <w:t>•  Sim-to-sim only, not hardware-validated</w:t>
+      </w:r>
+    </w:p>
+    <w:p>
+      <w:r>
+        <w:t>•  FetchReach is deliberately easy; may not transfer to contact-rich tasks</w:t>
+      </w:r>
+    </w:p>
+    <w:p>
+      <w:r>
+        <w:t>•  3 seeds; overlapping std bands on some comparisons</w:t>
+      </w:r>
+    </w:p>
+    <w:p>
+      <w:pPr>
+        <w:pStyle w:val="Heading1"/>
+      </w:pPr>
+      <w:r>
+        <w:t>9. Conclusion &amp; Future Work</w:t>
+      </w:r>
+    </w:p>
+    <w:p>
+      <w:r>
+        <w:t>•  Restate the practical takeaway (prefer slow curriculum over instant DR)</w:t>
+      </w:r>
+    </w:p>
+    <w:p>
+      <w:r>
+        <w:t>•  Next steps: hardware validation, system identification, FetchPush/PickAndPlace, more seeds, finer alpha grid near the slow end</w:t>
+      </w:r>
+    </w:p>
+    <w:p>
+      <w:pPr>
+        <w:pStyle w:val="Heading1"/>
+      </w:pPr>
+      <w:r>
+        <w:t>10. Reproducibility / Appendix</w:t>
+      </w:r>
+    </w:p>
+    <w:p>
+      <w:r>
+        <w:t>•  Stack &amp; versions, config files, one-command rerun</w:t>
+      </w:r>
+    </w:p>
+    <w:p>
+      <w:r>
+        <w:t>•  Optional appendix: per-seed raw numbers (eval_results.csv, ood_results.csv)</w:t>
       </w:r>
     </w:p>
     <w:sectPr>

</xml_diff>